<commit_message>
Phase 1: staging archival command + tracker close-out
- archive_older_business_dates: moves staging rows for business dates
  older than the latest LOADED date into staging history tables
  (pulled forward from Phase 3, owner decision 2026-09-28)
- TransactionFact.staging_row() falls back to history via original_id
- Tests repointed to sample_decrypted_files/14072026/; 8 archival tests
- tracker.md: Phase 1 components marked Done, open items given due points

Co-Authored-By: Claude Opus 5.5 <noreply@anthropic.com>
</commit_message>
<xml_diff>
--- a/docs/phase1_report.docx
+++ b/docs/phase1_report.docx
@@ -35,7 +35,7 @@
         <w:rPr>
           <w:color w:val="555555"/>
         </w:rPr>
-        <w:t>Prepared: 2026-09-27</w:t>
+        <w:t>Prepared: 2026-09-27 · Updated: 2026-09-30</w:t>
       </w:r>
     </w:p>
     <w:p>
@@ -58,6 +58,11 @@
     </w:p>
     <w:p>
       <w:r>
+        <w:t xml:space="preserve">Since then (2026-09-28 to 2026-09-30), two more business days were loaded, and the archiving job was pulled forward from Phase 3 and built, so older business dates now move out of the live staging tables into the history tables.</w:t>
+      </w:r>
+    </w:p>
+    <w:p>
+      <w:r>
         <w:t>Headline results:</w:t>
       </w:r>
     </w:p>
@@ -66,10 +71,7 @@
         <w:pStyle w:val="ListBullet"/>
       </w:pPr>
       <w:r>
-        <w:t>All 8 in-scope file types load end to end against real bank data for</w:t>
-      </w:r>
-      <w:r>
-        <w:t xml:space="preserve"> business date 2026-07-14: 59 files in total.</w:t>
+        <w:t xml:space="preserve">All 8 in-scope file types load end to end against real bank data for 3 business dates (2026-07-14, 2026-09-25 and 2026-09-26): 172 files in total, none rejected.</w:t>
       </w:r>
     </w:p>
     <w:p>
@@ -77,10 +79,7 @@
         <w:pStyle w:val="ListBullet"/>
       </w:pPr>
       <w:r>
-        <w:t>147,788 clean transactions in the fact table, plus 1,559 NTSL settlement</w:t>
-      </w:r>
-      <w:r>
-        <w:t xml:space="preserve"> lines.</w:t>
+        <w:t xml:space="preserve">447,078 clean transactions in the fact table across the 3 dates, plus 4,740 NTSL settlement lines.</w:t>
       </w:r>
     </w:p>
     <w:p>
@@ -88,7 +87,7 @@
         <w:pStyle w:val="ListBullet"/>
       </w:pPr>
       <w:r>
-        <w:t>91 automated tests, all passing.</w:t>
+        <w:t xml:space="preserve">99 automated tests, all passing.</w:t>
       </w:r>
     </w:p>
     <w:p>
@@ -100,6 +99,14 @@
       </w:r>
       <w:r>
         <w:t xml:space="preserve"> file it came from.</w:t>
+      </w:r>
+    </w:p>
+    <w:p>
+      <w:pPr>
+        <w:pStyle w:val="ListBullet"/>
+      </w:pPr>
+      <w:r>
+        <w:t xml:space="preserve">Older business dates are archived: staging now holds only the latest date (2026-09-26), and 482,181 rows for 14 July and 25 September moved to the history tables with nothing lost.</w:t>
       </w:r>
     </w:p>
     <w:p>
@@ -240,6 +247,30 @@
       </w:r>
     </w:p>
     <w:p>
+      <w:pPr>
+        <w:pStyle w:val="ListBullet"/>
+      </w:pPr>
+      <w:r>
+        <w:t xml:space="preserve">2026-09-28  Phase 1 committed to version control. Decision to build the archiving job now (pulled forward from Phase 3).</w:t>
+      </w:r>
+    </w:p>
+    <w:p>
+      <w:pPr>
+        <w:pStyle w:val="ListBullet"/>
+      </w:pPr>
+      <w:r>
+        <w:t xml:space="preserve">2026-09-29  Two more business days loaded (2026-09-25 and 2026-09-26), including the real CBS exports.</w:t>
+      </w:r>
+    </w:p>
+    <w:p>
+      <w:pPr>
+        <w:pStyle w:val="ListBullet"/>
+      </w:pPr>
+      <w:r>
+        <w:t xml:space="preserve">2026-09-30  Archiving job built, run on the real data and verified.</w:t>
+      </w:r>
+    </w:p>
+    <w:p>
       <w:r>
         <w:t>Original estimate: 3-4 weeks. Actual: about 4.5 weeks including the redesign. The project deadline is 2026-10-15 (set 2026-09-25), so Phase 1 finishing early matters for the phases that follow.</w:t>
       </w:r>
@@ -262,10 +293,7 @@
         <w:pStyle w:val="ListBullet"/>
       </w:pPr>
       <w:r>
-        <w:t>CBS GL Extract: the bank's own ledger. One daily file covering a</w:t>
-      </w:r>
-      <w:r>
-        <w:t xml:space="preserve"> 3-day range, spread over 3 worksheets.</w:t>
+        <w:t xml:space="preserve">CBS GL Extract: the bank's own ledger. One daily file covering a 3-day range, spread over 3 worksheets. The real exports for 25 and 26 September had exactly the same layout as 14 July and loaded with no changes.</w:t>
       </w:r>
     </w:p>
     <w:p>
@@ -332,7 +360,7 @@
     </w:p>
     <w:p>
       <w:r>
-        <w:t>Out of scope by design: SSKUPI14072026.csv is a file the bank sends to NPCI, not one it receives. It's kept as a reference for Phase 4 (NPCI File Generation).</w:t>
+        <w:t xml:space="preserve">Out of scope by design: the SSKUPI file (e.g. SSKUPI14072026.csv) is a file the bank sends to NPCI, not one it receives. It is not loaded, and it is no longer kept in the sample data folders. It is relevant to Phase 4 (NPCI File Generation).</w:t>
       </w:r>
     </w:p>
     <w:p>
@@ -576,6 +604,30 @@
     </w:p>
     <w:p>
       <w:pPr>
+        <w:pStyle w:val="ListBullet"/>
+      </w:pPr>
+      <w:r>
+        <w:t xml:space="preserve">Loading more days confirmed the configurations hold across dates. For 25 and 26 September the CBS worksheets and column layouts matched 14 July exactly, a BBP file arrived in cycle 7C (not seen in the 14 July data) and loaded, and both dispute-cycle NTSL files (DC1, DC2) loaded. No configuration change was needed.</w:t>
+      </w:r>
+    </w:p>
+    <w:p>
+      <w:pPr>
+        <w:pStyle w:val="ListBullet"/>
+      </w:pPr>
+      <w:r>
+        <w:t xml:space="preserve">Not every spreadsheet named "cbs" is a CBS export. The first files supplied for 25 and 26 September were the operations team's manual working workbooks (the CBS ledger pasted into a "1535" sheet, plus lookup sheets). They were rejected as a source and replaced with the real CBS exports. Only the CBS export itself should be loaded.</w:t>
+      </w:r>
+    </w:p>
+    <w:p>
+      <w:pPr>
+        <w:pStyle w:val="ListBullet"/>
+      </w:pPr>
+      <w:r>
+        <w:t xml:space="preserve">Archiving rule (decided 2026-09-28): when a newer business date has loaded, the staging rows of every older date move to the history tables. This was pulled forward from Phase 3, where it was planned to wait until reconciliation of a date was complete.</w:t>
+      </w:r>
+    </w:p>
+    <w:p>
+      <w:pPr>
         <w:pStyle w:val="Heading1"/>
       </w:pPr>
       <w:r>
@@ -690,10 +742,7 @@
         <w:pStyle w:val="ListBullet"/>
       </w:pPr>
       <w:r>
-        <w:t>Superseded data is never deleted; it's filtered out, keeping the audit</w:t>
-      </w:r>
-      <w:r>
-        <w:t xml:space="preserve"> trail intact.</w:t>
+        <w:t xml:space="preserve">Superseded data is never destroyed. Replaced file versions are filtered out rather than deleted, and archived staging rows are copied to history before they leave the live table, keeping the audit trail intact.</w:t>
       </w:r>
     </w:p>
     <w:p>
@@ -742,7 +791,7 @@
           <w:rFonts w:ascii="Consolas" w:hAnsi="Consolas"/>
           <w:sz w:val="19"/>
         </w:rPr>
-        <w:t xml:space="preserve">    old data -&gt; history tables (archiving job comes in Phase 3)</w:t>
+        <w:t xml:space="preserve">    older dates -&gt; history tables (archive_older_business_dates)</w:t>
       </w:r>
     </w:p>
     <w:p>
@@ -1025,7 +1074,17 @@
     </w:p>
     <w:p>
       <w:r>
-        <w:t>12 tables, each a copy of a live table plus the archive date and reason: 8 for staging, 1 for the fact table, 1 for the settlement summary and 2 for reconciliation. The tables exist now. The job that moves data into them runs once reconciliation for a business date is complete, which depends on Phase 3 (Exception Management / Maker-Checker).</w:t>
+        <w:t xml:space="preserve">12 tables, each a copy of a live table plus the archive date and reason: 8 for staging, 1 for the fact table, 1 for the settlement summary and 2 for reconciliation.</w:t>
+      </w:r>
+    </w:p>
+    <w:p>
+      <w:r>
+        <w:t xml:space="preserve">The staging archive is in use (built 2026-09-30). The command archive_older_business_dates finds the latest business date that has fully loaded, and moves every older date's staging rows into the matching history table: each row is copied with its original ID, then removed from staging. It can be run as a dry run first, and running it twice changes nothing.</w:t>
+      </w:r>
+    </w:p>
+    <w:p>
+      <w:r>
+        <w:t xml:space="preserve">The fact, settlement summary and reconciliation tables stay live; their history tables are not used yet (Phase 3). A transaction can still be traced back to its raw source row after archiving, through the original ID kept in history.</w:t>
       </w:r>
     </w:p>
     <w:p>
@@ -1046,12 +1105,20 @@
         <w:pStyle w:val="Heading1"/>
       </w:pPr>
       <w:r>
-        <w:t>7. Data loaded (business date 2026-07-14)</w:t>
+        <w:t xml:space="preserve">7. Data loaded (3 business dates)</w:t>
+      </w:r>
+    </w:p>
+    <w:p>
+      <w:pPr>
+        <w:pStyle w:val="Heading2"/>
+      </w:pPr>
+      <w:r>
+        <w:t xml:space="preserve">7.1 Business date 2026-07-14</w:t>
       </w:r>
     </w:p>
     <w:p>
       <w:r>
-        <w:t>All 59 files reached LOADED status.</w:t>
+        <w:t xml:space="preserve">All 59 files reached LOADED status.</w:t>
       </w:r>
     </w:p>
     <w:tbl>
@@ -1638,6 +1705,1137 @@
     </w:p>
     <w:p>
       <w:pPr>
+        <w:pStyle w:val="Heading2"/>
+      </w:pPr>
+      <w:r>
+        <w:t xml:space="preserve">7.2 Business dates 2026-09-25 and 2026-09-26</w:t>
+      </w:r>
+    </w:p>
+    <w:p>
+      <w:r>
+        <w:t xml:space="preserve">All 113 files (55 and 58) reached LOADED status, and no rows were rejected.</w:t>
+      </w:r>
+    </w:p>
+    <w:tbl>
+      <w:tblPr>
+        <w:tblStyle w:val="LightGrid-Accent1"/>
+        <w:tblW w:type="auto" w:w="0"/>
+        <w:jc w:val="center"/>
+        <w:tblLook w:firstColumn="1" w:firstRow="1" w:lastColumn="0" w:lastRow="0" w:noHBand="0" w:noVBand="1" w:val="04A0"/>
+      </w:tblPr>
+      <w:tblGrid>
+        <w:gridCol w:w="2381"/>
+        <w:gridCol w:w="2343"/>
+        <w:gridCol w:w="2343"/>
+        <w:gridCol w:w="2344"/>
+      </w:tblGrid>
+      <w:tr>
+        <w:tc>
+          <w:tcPr>
+            <w:tcW w:type="dxa" w:w="2381"/>
+          </w:tcPr>
+          <w:p>
+            <w:r>
+              <w:rPr>
+                <w:b/>
+              </w:rPr>
+              <w:t xml:space="preserve">File type</w:t>
+            </w:r>
+          </w:p>
+        </w:tc>
+        <w:tc>
+          <w:tcPr>
+            <w:tcW w:type="dxa" w:w="2343"/>
+          </w:tcPr>
+          <w:p>
+            <w:r>
+              <w:rPr>
+                <w:b/>
+              </w:rPr>
+              <w:t xml:space="preserve">Files (25 / 26 Sep)</w:t>
+            </w:r>
+          </w:p>
+        </w:tc>
+        <w:tc>
+          <w:tcPr>
+            <w:tcW w:type="dxa" w:w="2343"/>
+          </w:tcPr>
+          <w:p>
+            <w:r>
+              <w:rPr>
+                <w:b/>
+              </w:rPr>
+              <w:t xml:space="preserve">Clean rows 25 Sep</w:t>
+            </w:r>
+          </w:p>
+        </w:tc>
+        <w:tc>
+          <w:tcPr>
+            <w:tcW w:type="dxa" w:w="2344"/>
+          </w:tcPr>
+          <w:p>
+            <w:r>
+              <w:rPr>
+                <w:b/>
+              </w:rPr>
+              <w:t xml:space="preserve">Clean rows 26 Sep</w:t>
+            </w:r>
+          </w:p>
+        </w:tc>
+      </w:tr>
+      <w:tr>
+        <w:tc>
+          <w:tcPr>
+            <w:tcW w:type="dxa" w:w="2381"/>
+          </w:tcPr>
+          <w:p>
+            <w:r>
+              <w:t xml:space="preserve">CBS GL Extract</w:t>
+            </w:r>
+          </w:p>
+        </w:tc>
+        <w:tc>
+          <w:tcPr>
+            <w:tcW w:type="dxa" w:w="2343"/>
+          </w:tcPr>
+          <w:p>
+            <w:pPr>
+              <w:jc w:val="right"/>
+            </w:pPr>
+            <w:r>
+              <w:t xml:space="preserve">1 / 1</w:t>
+            </w:r>
+          </w:p>
+        </w:tc>
+        <w:tc>
+          <w:tcPr>
+            <w:tcW w:type="dxa" w:w="2343"/>
+          </w:tcPr>
+          <w:p>
+            <w:pPr>
+              <w:jc w:val="right"/>
+            </w:pPr>
+            <w:r>
+              <w:t xml:space="preserve">72,173</w:t>
+            </w:r>
+          </w:p>
+        </w:tc>
+        <w:tc>
+          <w:tcPr>
+            <w:tcW w:type="dxa" w:w="2344"/>
+          </w:tcPr>
+          <w:p>
+            <w:pPr>
+              <w:jc w:val="right"/>
+            </w:pPr>
+            <w:r>
+              <w:t xml:space="preserve">70,113</w:t>
+            </w:r>
+          </w:p>
+        </w:tc>
+      </w:tr>
+      <w:tr>
+        <w:tc>
+          <w:tcPr>
+            <w:tcW w:type="dxa" w:w="2381"/>
+          </w:tcPr>
+          <w:p>
+            <w:r>
+              <w:t xml:space="preserve">Raw Data</w:t>
+            </w:r>
+          </w:p>
+        </w:tc>
+        <w:tc>
+          <w:tcPr>
+            <w:tcW w:type="dxa" w:w="2343"/>
+          </w:tcPr>
+          <w:p>
+            <w:pPr>
+              <w:jc w:val="right"/>
+            </w:pPr>
+            <w:r>
+              <w:t xml:space="preserve">20 / 20</w:t>
+            </w:r>
+          </w:p>
+        </w:tc>
+        <w:tc>
+          <w:tcPr>
+            <w:tcW w:type="dxa" w:w="2343"/>
+          </w:tcPr>
+          <w:p>
+            <w:pPr>
+              <w:jc w:val="right"/>
+            </w:pPr>
+            <w:r>
+              <w:t xml:space="preserve">46,030</w:t>
+            </w:r>
+          </w:p>
+        </w:tc>
+        <w:tc>
+          <w:tcPr>
+            <w:tcW w:type="dxa" w:w="2344"/>
+          </w:tcPr>
+          <w:p>
+            <w:pPr>
+              <w:jc w:val="right"/>
+            </w:pPr>
+            <w:r>
+              <w:t xml:space="preserve">43,692</w:t>
+            </w:r>
+          </w:p>
+        </w:tc>
+      </w:tr>
+      <w:tr>
+        <w:tc>
+          <w:tcPr>
+            <w:tcW w:type="dxa" w:w="2381"/>
+          </w:tcPr>
+          <w:p>
+            <w:r>
+              <w:t xml:space="preserve">Merchant Raw Data</w:t>
+            </w:r>
+          </w:p>
+        </w:tc>
+        <w:tc>
+          <w:tcPr>
+            <w:tcW w:type="dxa" w:w="2343"/>
+          </w:tcPr>
+          <w:p>
+            <w:pPr>
+              <w:jc w:val="right"/>
+            </w:pPr>
+            <w:r>
+              <w:t xml:space="preserve">19 / 19</w:t>
+            </w:r>
+          </w:p>
+        </w:tc>
+        <w:tc>
+          <w:tcPr>
+            <w:tcW w:type="dxa" w:w="2343"/>
+          </w:tcPr>
+          <w:p>
+            <w:pPr>
+              <w:jc w:val="right"/>
+            </w:pPr>
+            <w:r>
+              <w:t xml:space="preserve">33,887</w:t>
+            </w:r>
+          </w:p>
+        </w:tc>
+        <w:tc>
+          <w:tcPr>
+            <w:tcW w:type="dxa" w:w="2344"/>
+          </w:tcPr>
+          <w:p>
+            <w:pPr>
+              <w:jc w:val="right"/>
+            </w:pPr>
+            <w:r>
+              <w:t xml:space="preserve">33,158</w:t>
+            </w:r>
+          </w:p>
+        </w:tc>
+      </w:tr>
+      <w:tr>
+        <w:tc>
+          <w:tcPr>
+            <w:tcW w:type="dxa" w:w="2381"/>
+          </w:tcPr>
+          <w:p>
+            <w:r>
+              <w:t xml:space="preserve">BBP</w:t>
+            </w:r>
+          </w:p>
+        </w:tc>
+        <w:tc>
+          <w:tcPr>
+            <w:tcW w:type="dxa" w:w="2343"/>
+          </w:tcPr>
+          <w:p>
+            <w:pPr>
+              <w:jc w:val="right"/>
+            </w:pPr>
+            <w:r>
+              <w:t xml:space="preserve">0 / 3</w:t>
+            </w:r>
+          </w:p>
+        </w:tc>
+        <w:tc>
+          <w:tcPr>
+            <w:tcW w:type="dxa" w:w="2343"/>
+          </w:tcPr>
+          <w:p>
+            <w:pPr>
+              <w:jc w:val="right"/>
+            </w:pPr>
+            <w:r>
+              <w:t xml:space="preserve">–</w:t>
+            </w:r>
+          </w:p>
+        </w:tc>
+        <w:tc>
+          <w:tcPr>
+            <w:tcW w:type="dxa" w:w="2344"/>
+          </w:tcPr>
+          <w:p>
+            <w:pPr>
+              <w:jc w:val="right"/>
+            </w:pPr>
+            <w:r>
+              <w:t xml:space="preserve">3</w:t>
+            </w:r>
+          </w:p>
+        </w:tc>
+      </w:tr>
+      <w:tr>
+        <w:tc>
+          <w:tcPr>
+            <w:tcW w:type="dxa" w:w="2381"/>
+          </w:tcPr>
+          <w:p>
+            <w:r>
+              <w:t xml:space="preserve">DRC</w:t>
+            </w:r>
+          </w:p>
+        </w:tc>
+        <w:tc>
+          <w:tcPr>
+            <w:tcW w:type="dxa" w:w="2343"/>
+          </w:tcPr>
+          <w:p>
+            <w:pPr>
+              <w:jc w:val="right"/>
+            </w:pPr>
+            <w:r>
+              <w:t xml:space="preserve">1 / 1</w:t>
+            </w:r>
+          </w:p>
+        </w:tc>
+        <w:tc>
+          <w:tcPr>
+            <w:tcW w:type="dxa" w:w="2343"/>
+          </w:tcPr>
+          <w:p>
+            <w:pPr>
+              <w:jc w:val="right"/>
+            </w:pPr>
+            <w:r>
+              <w:t xml:space="preserve">44</w:t>
+            </w:r>
+          </w:p>
+        </w:tc>
+        <w:tc>
+          <w:tcPr>
+            <w:tcW w:type="dxa" w:w="2344"/>
+          </w:tcPr>
+          <w:p>
+            <w:pPr>
+              <w:jc w:val="right"/>
+            </w:pPr>
+            <w:r>
+              <w:t xml:space="preserve">11</w:t>
+            </w:r>
+          </w:p>
+        </w:tc>
+      </w:tr>
+      <w:tr>
+        <w:tc>
+          <w:tcPr>
+            <w:tcW w:type="dxa" w:w="2381"/>
+          </w:tcPr>
+          <w:p>
+            <w:r>
+              <w:t xml:space="preserve">Timeout</w:t>
+            </w:r>
+          </w:p>
+        </w:tc>
+        <w:tc>
+          <w:tcPr>
+            <w:tcW w:type="dxa" w:w="2343"/>
+          </w:tcPr>
+          <w:p>
+            <w:pPr>
+              <w:jc w:val="right"/>
+            </w:pPr>
+            <w:r>
+              <w:t xml:space="preserve">1 / 1</w:t>
+            </w:r>
+          </w:p>
+        </w:tc>
+        <w:tc>
+          <w:tcPr>
+            <w:tcW w:type="dxa" w:w="2343"/>
+          </w:tcPr>
+          <w:p>
+            <w:pPr>
+              <w:jc w:val="right"/>
+            </w:pPr>
+            <w:r>
+              <w:t xml:space="preserve">6</w:t>
+            </w:r>
+          </w:p>
+        </w:tc>
+        <w:tc>
+          <w:tcPr>
+            <w:tcW w:type="dxa" w:w="2344"/>
+          </w:tcPr>
+          <w:p>
+            <w:pPr>
+              <w:jc w:val="right"/>
+            </w:pPr>
+            <w:r>
+              <w:t xml:space="preserve">6</w:t>
+            </w:r>
+          </w:p>
+        </w:tc>
+      </w:tr>
+      <w:tr>
+        <w:tc>
+          <w:tcPr>
+            <w:tcW w:type="dxa" w:w="2381"/>
+          </w:tcPr>
+          <w:p>
+            <w:r>
+              <w:t xml:space="preserve">Adjustment</w:t>
+            </w:r>
+          </w:p>
+        </w:tc>
+        <w:tc>
+          <w:tcPr>
+            <w:tcW w:type="dxa" w:w="2343"/>
+          </w:tcPr>
+          <w:p>
+            <w:pPr>
+              <w:jc w:val="right"/>
+            </w:pPr>
+            <w:r>
+              <w:t xml:space="preserve">1 / 1</w:t>
+            </w:r>
+          </w:p>
+        </w:tc>
+        <w:tc>
+          <w:tcPr>
+            <w:tcW w:type="dxa" w:w="2343"/>
+          </w:tcPr>
+          <w:p>
+            <w:pPr>
+              <w:jc w:val="right"/>
+            </w:pPr>
+            <w:r>
+              <w:t xml:space="preserve">92</w:t>
+            </w:r>
+          </w:p>
+        </w:tc>
+        <w:tc>
+          <w:tcPr>
+            <w:tcW w:type="dxa" w:w="2344"/>
+          </w:tcPr>
+          <w:p>
+            <w:pPr>
+              <w:jc w:val="right"/>
+            </w:pPr>
+            <w:r>
+              <w:t xml:space="preserve">75</w:t>
+            </w:r>
+          </w:p>
+        </w:tc>
+      </w:tr>
+      <w:tr>
+        <w:tc>
+          <w:tcPr>
+            <w:tcW w:type="dxa" w:w="2381"/>
+          </w:tcPr>
+          <w:p>
+            <w:r>
+              <w:t xml:space="preserve">NTSL</w:t>
+            </w:r>
+          </w:p>
+        </w:tc>
+        <w:tc>
+          <w:tcPr>
+            <w:tcW w:type="dxa" w:w="2343"/>
+          </w:tcPr>
+          <w:p>
+            <w:pPr>
+              <w:jc w:val="right"/>
+            </w:pPr>
+            <w:r>
+              <w:t xml:space="preserve">12 / 12</w:t>
+            </w:r>
+          </w:p>
+        </w:tc>
+        <w:tc>
+          <w:tcPr>
+            <w:tcW w:type="dxa" w:w="2343"/>
+          </w:tcPr>
+          <w:p>
+            <w:pPr>
+              <w:jc w:val="right"/>
+            </w:pPr>
+            <w:r>
+              <w:t xml:space="preserve">1,579 lines</w:t>
+            </w:r>
+          </w:p>
+        </w:tc>
+        <w:tc>
+          <w:tcPr>
+            <w:tcW w:type="dxa" w:w="2344"/>
+          </w:tcPr>
+          <w:p>
+            <w:pPr>
+              <w:jc w:val="right"/>
+            </w:pPr>
+            <w:r>
+              <w:t xml:space="preserve">1,602 lines</w:t>
+            </w:r>
+          </w:p>
+        </w:tc>
+      </w:tr>
+      <w:tr>
+        <w:tc>
+          <w:tcPr>
+            <w:tcW w:type="dxa" w:w="2381"/>
+          </w:tcPr>
+          <w:p>
+            <w:r>
+              <w:rPr>
+                <w:b/>
+              </w:rPr>
+              <w:t xml:space="preserve">Total fact rows</w:t>
+            </w:r>
+          </w:p>
+        </w:tc>
+        <w:tc>
+          <w:tcPr>
+            <w:tcW w:type="dxa" w:w="2343"/>
+          </w:tcPr>
+          <w:p/>
+        </w:tc>
+        <w:tc>
+          <w:tcPr>
+            <w:tcW w:type="dxa" w:w="2343"/>
+          </w:tcPr>
+          <w:p>
+            <w:pPr>
+              <w:jc w:val="right"/>
+            </w:pPr>
+            <w:r>
+              <w:rPr>
+                <w:b/>
+              </w:rPr>
+              <w:t xml:space="preserve">152,232</w:t>
+            </w:r>
+          </w:p>
+        </w:tc>
+        <w:tc>
+          <w:tcPr>
+            <w:tcW w:type="dxa" w:w="2344"/>
+          </w:tcPr>
+          <w:p>
+            <w:pPr>
+              <w:jc w:val="right"/>
+            </w:pPr>
+            <w:r>
+              <w:rPr>
+                <w:b/>
+              </w:rPr>
+              <w:t xml:space="preserve">147,058</w:t>
+            </w:r>
+          </w:p>
+        </w:tc>
+      </w:tr>
+    </w:tbl>
+    <w:p/>
+    <w:p>
+      <w:r>
+        <w:t xml:space="preserve">Notes:</w:t>
+      </w:r>
+    </w:p>
+    <w:p>
+      <w:pPr>
+        <w:pStyle w:val="ListBullet"/>
+      </w:pPr>
+      <w:r>
+        <w:t xml:space="preserve">Merchant Raw Data has 19 files a day because there was no Issuer file for cycle 2C on either day.</w:t>
+      </w:r>
+    </w:p>
+    <w:p>
+      <w:pPr>
+        <w:pStyle w:val="ListBullet"/>
+      </w:pPr>
+      <w:r>
+        <w:t xml:space="preserve">One Adjustment row in the 25 September file has an adjustment date of 26 September, so it counts towards 26 September (the row's own date wins).</w:t>
+      </w:r>
+    </w:p>
+    <w:p>
+      <w:pPr>
+        <w:pStyle w:val="ListBullet"/>
+      </w:pPr>
+      <w:r>
+        <w:t xml:space="preserve">Debit/credit split in the fact table:</w:t>
+      </w:r>
+    </w:p>
+    <w:p>
+      <w:pPr>
+        <w:pStyle w:val="ListBullet2"/>
+      </w:pPr>
+      <w:r>
+        <w:t xml:space="preserve">25 Sep: CBS 47,167 credit, 25,004 debit, 2 undetermined; Raw Data 19,582 debit, 26,448 credit; Merchant Raw Data 33,458 debit, 429 credit.</w:t>
+      </w:r>
+    </w:p>
+    <w:p>
+      <w:pPr>
+        <w:pStyle w:val="ListBullet2"/>
+      </w:pPr>
+      <w:r>
+        <w:t xml:space="preserve">26 Sep: CBS 46,182 credit, 23,931 debit; Raw Data 18,649 debit, 25,043 credit; Merchant Raw Data 32,738 debit, 420 credit; BBP 3 debit.</w:t>
+      </w:r>
+    </w:p>
+    <w:p>
+      <w:pPr>
+        <w:pStyle w:val="ListBullet2"/>
+      </w:pPr>
+      <w:r>
+        <w:t xml:space="preserve">Both days: DRC all debit; Timeout and Adjustment all credit.</w:t>
+      </w:r>
+    </w:p>
+    <w:p>
+      <w:pPr>
+        <w:pStyle w:val="ListBullet"/>
+      </w:pPr>
+      <w:r>
+        <w:t xml:space="preserve">Across all 3 dates the fact table holds 447,078 rows.</w:t>
+      </w:r>
+    </w:p>
+    <w:p>
+      <w:pPr>
+        <w:pStyle w:val="Heading2"/>
+      </w:pPr>
+      <w:r>
+        <w:t xml:space="preserve">7.3 Where the data sits after archiving</w:t>
+      </w:r>
+    </w:p>
+    <w:p>
+      <w:r>
+        <w:t xml:space="preserve">The archiving run on 2026-09-30 moved 482,181 staging rows in about 2 minutes:</w:t>
+      </w:r>
+    </w:p>
+    <w:tbl>
+      <w:tblPr>
+        <w:tblStyle w:val="LightGrid-Accent1"/>
+        <w:tblW w:type="auto" w:w="0"/>
+        <w:jc w:val="center"/>
+        <w:tblLook w:firstColumn="1" w:firstRow="1" w:lastColumn="0" w:lastRow="0" w:noHBand="0" w:noVBand="1" w:val="04A0"/>
+      </w:tblPr>
+      <w:tblGrid>
+        <w:gridCol w:w="2381"/>
+        <w:gridCol w:w="2343"/>
+        <w:gridCol w:w="2343"/>
+        <w:gridCol w:w="2344"/>
+      </w:tblGrid>
+      <w:tr>
+        <w:tc>
+          <w:tcPr>
+            <w:tcW w:type="dxa" w:w="2381"/>
+          </w:tcPr>
+          <w:p>
+            <w:r>
+              <w:rPr>
+                <w:b/>
+              </w:rPr>
+              <w:t xml:space="preserve">Staging table</w:t>
+            </w:r>
+          </w:p>
+        </w:tc>
+        <w:tc>
+          <w:tcPr>
+            <w:tcW w:type="dxa" w:w="2343"/>
+          </w:tcPr>
+          <w:p>
+            <w:r>
+              <w:rPr>
+                <w:b/>
+              </w:rPr>
+              <w:t xml:space="preserve">Staging (26 Sep)</w:t>
+            </w:r>
+          </w:p>
+        </w:tc>
+        <w:tc>
+          <w:tcPr>
+            <w:tcW w:type="dxa" w:w="2343"/>
+          </w:tcPr>
+          <w:p>
+            <w:r>
+              <w:rPr>
+                <w:b/>
+              </w:rPr>
+              <w:t xml:space="preserve">History (14 Jul)</w:t>
+            </w:r>
+          </w:p>
+        </w:tc>
+        <w:tc>
+          <w:tcPr>
+            <w:tcW w:type="dxa" w:w="2344"/>
+          </w:tcPr>
+          <w:p>
+            <w:r>
+              <w:rPr>
+                <w:b/>
+              </w:rPr>
+              <w:t xml:space="preserve">History (25 Sep)</w:t>
+            </w:r>
+          </w:p>
+        </w:tc>
+      </w:tr>
+      <w:tr>
+        <w:tc>
+          <w:tcPr>
+            <w:tcW w:type="dxa" w:w="2381"/>
+          </w:tcPr>
+          <w:p>
+            <w:r>
+              <w:t xml:space="preserve">CBS GL Extract</w:t>
+            </w:r>
+          </w:p>
+        </w:tc>
+        <w:tc>
+          <w:tcPr>
+            <w:tcW w:type="dxa" w:w="2343"/>
+          </w:tcPr>
+          <w:p>
+            <w:pPr>
+              <w:jc w:val="right"/>
+            </w:pPr>
+            <w:r>
+              <w:t xml:space="preserve">147,082</w:t>
+            </w:r>
+          </w:p>
+        </w:tc>
+        <w:tc>
+          <w:tcPr>
+            <w:tcW w:type="dxa" w:w="2343"/>
+          </w:tcPr>
+          <w:p>
+            <w:pPr>
+              <w:jc w:val="right"/>
+            </w:pPr>
+            <w:r>
+              <w:t xml:space="preserve">154,651</w:t>
+            </w:r>
+          </w:p>
+        </w:tc>
+        <w:tc>
+          <w:tcPr>
+            <w:tcW w:type="dxa" w:w="2344"/>
+          </w:tcPr>
+          <w:p>
+            <w:pPr>
+              <w:jc w:val="right"/>
+            </w:pPr>
+            <w:r>
+              <w:t xml:space="preserve">156,921</w:t>
+            </w:r>
+          </w:p>
+        </w:tc>
+      </w:tr>
+      <w:tr>
+        <w:tc>
+          <w:tcPr>
+            <w:tcW w:type="dxa" w:w="2381"/>
+          </w:tcPr>
+          <w:p>
+            <w:r>
+              <w:t xml:space="preserve">Raw Data</w:t>
+            </w:r>
+          </w:p>
+        </w:tc>
+        <w:tc>
+          <w:tcPr>
+            <w:tcW w:type="dxa" w:w="2343"/>
+          </w:tcPr>
+          <w:p>
+            <w:pPr>
+              <w:jc w:val="right"/>
+            </w:pPr>
+            <w:r>
+              <w:t xml:space="preserve">43,692</w:t>
+            </w:r>
+          </w:p>
+        </w:tc>
+        <w:tc>
+          <w:tcPr>
+            <w:tcW w:type="dxa" w:w="2343"/>
+          </w:tcPr>
+          <w:p>
+            <w:pPr>
+              <w:jc w:val="right"/>
+            </w:pPr>
+            <w:r>
+              <w:t xml:space="preserve">44,435</w:t>
+            </w:r>
+          </w:p>
+        </w:tc>
+        <w:tc>
+          <w:tcPr>
+            <w:tcW w:type="dxa" w:w="2344"/>
+          </w:tcPr>
+          <w:p>
+            <w:pPr>
+              <w:jc w:val="right"/>
+            </w:pPr>
+            <w:r>
+              <w:t xml:space="preserve">46,030</w:t>
+            </w:r>
+          </w:p>
+        </w:tc>
+      </w:tr>
+      <w:tr>
+        <w:tc>
+          <w:tcPr>
+            <w:tcW w:type="dxa" w:w="2381"/>
+          </w:tcPr>
+          <w:p>
+            <w:r>
+              <w:t xml:space="preserve">Merchant Raw Data</w:t>
+            </w:r>
+          </w:p>
+        </w:tc>
+        <w:tc>
+          <w:tcPr>
+            <w:tcW w:type="dxa" w:w="2343"/>
+          </w:tcPr>
+          <w:p>
+            <w:pPr>
+              <w:jc w:val="right"/>
+            </w:pPr>
+            <w:r>
+              <w:t xml:space="preserve">33,158</w:t>
+            </w:r>
+          </w:p>
+        </w:tc>
+        <w:tc>
+          <w:tcPr>
+            <w:tcW w:type="dxa" w:w="2343"/>
+          </w:tcPr>
+          <w:p>
+            <w:pPr>
+              <w:jc w:val="right"/>
+            </w:pPr>
+            <w:r>
+              <w:t xml:space="preserve">33,550</w:t>
+            </w:r>
+          </w:p>
+        </w:tc>
+        <w:tc>
+          <w:tcPr>
+            <w:tcW w:type="dxa" w:w="2344"/>
+          </w:tcPr>
+          <w:p>
+            <w:pPr>
+              <w:jc w:val="right"/>
+            </w:pPr>
+            <w:r>
+              <w:t xml:space="preserve">33,887</w:t>
+            </w:r>
+          </w:p>
+        </w:tc>
+      </w:tr>
+      <w:tr>
+        <w:tc>
+          <w:tcPr>
+            <w:tcW w:type="dxa" w:w="2381"/>
+          </w:tcPr>
+          <w:p>
+            <w:r>
+              <w:t xml:space="preserve">BBP</w:t>
+            </w:r>
+          </w:p>
+        </w:tc>
+        <w:tc>
+          <w:tcPr>
+            <w:tcW w:type="dxa" w:w="2343"/>
+          </w:tcPr>
+          <w:p>
+            <w:pPr>
+              <w:jc w:val="right"/>
+            </w:pPr>
+            <w:r>
+              <w:t xml:space="preserve">3</w:t>
+            </w:r>
+          </w:p>
+        </w:tc>
+        <w:tc>
+          <w:tcPr>
+            <w:tcW w:type="dxa" w:w="2343"/>
+          </w:tcPr>
+          <w:p>
+            <w:pPr>
+              <w:jc w:val="right"/>
+            </w:pPr>
+            <w:r>
+              <w:t xml:space="preserve">4</w:t>
+            </w:r>
+          </w:p>
+        </w:tc>
+        <w:tc>
+          <w:tcPr>
+            <w:tcW w:type="dxa" w:w="2344"/>
+          </w:tcPr>
+          <w:p>
+            <w:pPr>
+              <w:jc w:val="right"/>
+            </w:pPr>
+            <w:r>
+              <w:t xml:space="preserve">–</w:t>
+            </w:r>
+          </w:p>
+        </w:tc>
+      </w:tr>
+      <w:tr>
+        <w:tc>
+          <w:tcPr>
+            <w:tcW w:type="dxa" w:w="2381"/>
+          </w:tcPr>
+          <w:p>
+            <w:r>
+              <w:t xml:space="preserve">DRC</w:t>
+            </w:r>
+          </w:p>
+        </w:tc>
+        <w:tc>
+          <w:tcPr>
+            <w:tcW w:type="dxa" w:w="2343"/>
+          </w:tcPr>
+          <w:p>
+            <w:pPr>
+              <w:jc w:val="right"/>
+            </w:pPr>
+            <w:r>
+              <w:t xml:space="preserve">11</w:t>
+            </w:r>
+          </w:p>
+        </w:tc>
+        <w:tc>
+          <w:tcPr>
+            <w:tcW w:type="dxa" w:w="2343"/>
+          </w:tcPr>
+          <w:p>
+            <w:pPr>
+              <w:jc w:val="right"/>
+            </w:pPr>
+            <w:r>
+              <w:t xml:space="preserve">273</w:t>
+            </w:r>
+          </w:p>
+        </w:tc>
+        <w:tc>
+          <w:tcPr>
+            <w:tcW w:type="dxa" w:w="2344"/>
+          </w:tcPr>
+          <w:p>
+            <w:pPr>
+              <w:jc w:val="right"/>
+            </w:pPr>
+            <w:r>
+              <w:t xml:space="preserve">44</w:t>
+            </w:r>
+          </w:p>
+        </w:tc>
+      </w:tr>
+      <w:tr>
+        <w:tc>
+          <w:tcPr>
+            <w:tcW w:type="dxa" w:w="2381"/>
+          </w:tcPr>
+          <w:p>
+            <w:r>
+              <w:t xml:space="preserve">Timeout</w:t>
+            </w:r>
+          </w:p>
+        </w:tc>
+        <w:tc>
+          <w:tcPr>
+            <w:tcW w:type="dxa" w:w="2343"/>
+          </w:tcPr>
+          <w:p>
+            <w:pPr>
+              <w:jc w:val="right"/>
+            </w:pPr>
+            <w:r>
+              <w:t xml:space="preserve">6</w:t>
+            </w:r>
+          </w:p>
+        </w:tc>
+        <w:tc>
+          <w:tcPr>
+            <w:tcW w:type="dxa" w:w="2343"/>
+          </w:tcPr>
+          <w:p>
+            <w:pPr>
+              <w:jc w:val="right"/>
+            </w:pPr>
+            <w:r>
+              <w:t xml:space="preserve">30</w:t>
+            </w:r>
+          </w:p>
+        </w:tc>
+        <w:tc>
+          <w:tcPr>
+            <w:tcW w:type="dxa" w:w="2344"/>
+          </w:tcPr>
+          <w:p>
+            <w:pPr>
+              <w:jc w:val="right"/>
+            </w:pPr>
+            <w:r>
+              <w:t xml:space="preserve">6</w:t>
+            </w:r>
+          </w:p>
+        </w:tc>
+      </w:tr>
+      <w:tr>
+        <w:tc>
+          <w:tcPr>
+            <w:tcW w:type="dxa" w:w="2381"/>
+          </w:tcPr>
+          <w:p>
+            <w:r>
+              <w:t xml:space="preserve">Adjustment</w:t>
+            </w:r>
+          </w:p>
+        </w:tc>
+        <w:tc>
+          <w:tcPr>
+            <w:tcW w:type="dxa" w:w="2343"/>
+          </w:tcPr>
+          <w:p>
+            <w:pPr>
+              <w:jc w:val="right"/>
+            </w:pPr>
+            <w:r>
+              <w:t xml:space="preserve">74</w:t>
+            </w:r>
+          </w:p>
+        </w:tc>
+        <w:tc>
+          <w:tcPr>
+            <w:tcW w:type="dxa" w:w="2343"/>
+          </w:tcPr>
+          <w:p>
+            <w:pPr>
+              <w:jc w:val="right"/>
+            </w:pPr>
+            <w:r>
+              <w:t xml:space="preserve">257</w:t>
+            </w:r>
+          </w:p>
+        </w:tc>
+        <w:tc>
+          <w:tcPr>
+            <w:tcW w:type="dxa" w:w="2344"/>
+          </w:tcPr>
+          <w:p>
+            <w:pPr>
+              <w:jc w:val="right"/>
+            </w:pPr>
+            <w:r>
+              <w:t xml:space="preserve">93</w:t>
+            </w:r>
+          </w:p>
+        </w:tc>
+      </w:tr>
+      <w:tr>
+        <w:tc>
+          <w:tcPr>
+            <w:tcW w:type="dxa" w:w="2381"/>
+          </w:tcPr>
+          <w:p>
+            <w:r>
+              <w:t xml:space="preserve">NTSL</w:t>
+            </w:r>
+          </w:p>
+        </w:tc>
+        <w:tc>
+          <w:tcPr>
+            <w:tcW w:type="dxa" w:w="2343"/>
+          </w:tcPr>
+          <w:p>
+            <w:pPr>
+              <w:jc w:val="right"/>
+            </w:pPr>
+            <w:r>
+              <w:t xml:space="preserve">6,000</w:t>
+            </w:r>
+          </w:p>
+        </w:tc>
+        <w:tc>
+          <w:tcPr>
+            <w:tcW w:type="dxa" w:w="2343"/>
+          </w:tcPr>
+          <w:p>
+            <w:pPr>
+              <w:jc w:val="right"/>
+            </w:pPr>
+            <w:r>
+              <w:t xml:space="preserve">6,000</w:t>
+            </w:r>
+          </w:p>
+        </w:tc>
+        <w:tc>
+          <w:tcPr>
+            <w:tcW w:type="dxa" w:w="2344"/>
+          </w:tcPr>
+          <w:p>
+            <w:pPr>
+              <w:jc w:val="right"/>
+            </w:pPr>
+            <w:r>
+              <w:t xml:space="preserve">6,000</w:t>
+            </w:r>
+          </w:p>
+        </w:tc>
+      </w:tr>
+    </w:tbl>
+    <w:p/>
+    <w:p>
+      <w:r>
+        <w:t xml:space="preserve">Checks:</w:t>
+      </w:r>
+    </w:p>
+    <w:p>
+      <w:pPr>
+        <w:pStyle w:val="ListBullet"/>
+      </w:pPr>
+      <w:r>
+        <w:t xml:space="preserve">For every table and date, staging plus history equals the count before archiving; no row was lost or copied twice.</w:t>
+      </w:r>
+    </w:p>
+    <w:p>
+      <w:pPr>
+        <w:pStyle w:val="ListBullet"/>
+      </w:pPr>
+      <w:r>
+        <w:t xml:space="preserve">The fact table (447,078 rows) and the settlement summary (4,740 lines) were not touched.</w:t>
+      </w:r>
+    </w:p>
+    <w:p>
+      <w:pPr>
+        <w:pStyle w:val="ListBullet"/>
+      </w:pPr>
+      <w:r>
+        <w:t xml:space="preserve">A sample of 330 transactions across all dates and file types all traced back to their raw row: in history for 14 July and 25 September, in staging for 26 September.</w:t>
+      </w:r>
+    </w:p>
+    <w:p>
+      <w:pPr>
+        <w:pStyle w:val="ListBullet"/>
+      </w:pPr>
+      <w:r>
+        <w:t xml:space="preserve">Running the command again archives nothing.</w:t>
+      </w:r>
+    </w:p>
+    <w:p>
+      <w:pPr>
         <w:pStyle w:val="Heading1"/>
       </w:pPr>
       <w:r>
@@ -1649,10 +2847,7 @@
         <w:pStyle w:val="ListBullet"/>
       </w:pPr>
       <w:r>
-        <w:t>91 automated tests, all passing. Many run against the real sample files,</w:t>
-      </w:r>
-      <w:r>
-        <w:t xml:space="preserve"> not made-up data.</w:t>
+        <w:t xml:space="preserve">99 automated tests, all passing. Many run against the real sample files, not made-up data. 8 of them cover the archiving job.</w:t>
       </w:r>
     </w:p>
     <w:p>
@@ -1667,6 +2862,14 @@
       </w:r>
       <w:r>
         <w:t xml:space="preserve"> database state.</w:t>
+      </w:r>
+    </w:p>
+    <w:p>
+      <w:pPr>
+        <w:pStyle w:val="ListBullet"/>
+      </w:pPr>
+      <w:r>
+        <w:t xml:space="preserve">The 25/26 September load and the archiving job were done step by step, with the project owner approving each change and command. After the sample data was reorganised into one folder per date, two test modules were pointed to the 14 July folder.</w:t>
       </w:r>
     </w:p>
     <w:p>
@@ -1801,7 +3004,15 @@
         <w:pStyle w:val="ListBullet"/>
       </w:pPr>
       <w:r>
-        <w:t>The archiving job for the history tables (Phase 3).</w:t>
+        <w:t xml:space="preserve">Archiving trigger for production: confirm "archive when a newer date loads" versus waiting until a date's reconciliation is complete, and whether it should run automatically after each day's load. Archiving the fact, settlement summary and reconciliation tables is still Phase 3.</w:t>
+      </w:r>
+    </w:p>
+    <w:p>
+      <w:pPr>
+        <w:pStyle w:val="ListBullet"/>
+      </w:pPr>
+      <w:r>
+        <w:t xml:space="preserve">Reprocessing an archived date: once a date's staging rows are archived, reprocessing one of its files finds no raw rows to work from. A rule is needed (restore from history, re-read the source file, or block it).</w:t>
       </w:r>
     </w:p>
     <w:p>
@@ -1831,10 +3042,7 @@
         <w:pStyle w:val="ListBullet"/>
       </w:pPr>
       <w:r>
-        <w:t>The Phase 1 work is not yet committed to version control, and the</w:t>
-      </w:r>
-      <w:r>
-        <w:t xml:space="preserve"> CHANGELOG entries are pending. Both are waiting on the project owner.</w:t>
+        <w:t xml:space="preserve">The Phase 1 work was committed to version control on 2026-09-28 (commit 543222e), with its CHANGELOG entries. The 25/26 September load and the archiving job are not yet committed, and their CHANGELOG entry is pending the project owner.</w:t>
       </w:r>
     </w:p>
     <w:p>

</xml_diff>